<commit_message>
thêm ngày 16 - 03 - 2026 OJ
</commit_message>
<xml_diff>
--- a/OJ/14 - 03 - 2026/tổng hợp bài theo 4 dạng của đề.docx
+++ b/OJ/14 - 03 - 2026/tổng hợp bài theo 4 dạng của đề.docx
@@ -50,6 +50,9 @@
           <w:t>https://luyencode.net/problem/fanum</w:t>
         </w:r>
       </w:hyperlink>
+      <w:r>
+        <w:t xml:space="preserve"> #FULL</w:t>
+      </w:r>
     </w:p>
     <w:p>
       <w:r>
@@ -131,6 +134,9 @@
           <w:t>https://luyencode.net/problem/artteams</w:t>
         </w:r>
       </w:hyperlink>
+      <w:r>
+        <w:t xml:space="preserve"> #FULL</w:t>
+      </w:r>
     </w:p>
     <w:p>
       <w:r>
@@ -144,6 +150,9 @@
           <w:t>https://luyencode.net/problem/garden</w:t>
         </w:r>
       </w:hyperlink>
+      <w:r>
+        <w:t xml:space="preserve"> #FULL</w:t>
+      </w:r>
     </w:p>
     <w:p>
       <w:r>
@@ -173,6 +182,9 @@
       </w:hyperlink>
     </w:p>
     <w:p>
+      <w:r>
+        <w:t xml:space="preserve">F </w:t>
+      </w:r>
       <w:hyperlink r:id="rId14" w:history="1">
         <w:r>
           <w:rPr>
@@ -184,67 +196,129 @@
     </w:p>
     <w:p>
       <w:r>
+        <w:t xml:space="preserve">F </w:t>
+      </w:r>
+      <w:hyperlink r:id="rId15" w:history="1">
+        <w:r>
+          <w:rPr>
+            <w:rStyle w:val="Hyperlink"/>
+          </w:rPr>
+          <w:t>https://luyencode.net/problem/dpmarket</w:t>
+        </w:r>
+      </w:hyperlink>
+    </w:p>
+    <w:p>
+      <w:r>
+        <w:t>F</w:t>
+      </w:r>
+      <w:r>
+        <w:t xml:space="preserve"> </w:t>
+      </w:r>
+      <w:hyperlink r:id="rId16" w:history="1">
+        <w:r>
+          <w:rPr>
+            <w:rStyle w:val="Hyperlink"/>
+          </w:rPr>
+          <w:t>https://luyencode.net/problem/dpwater</w:t>
+        </w:r>
+      </w:hyperlink>
+    </w:p>
+    <w:p>
+      <w:r>
+        <w:t xml:space="preserve">X </w:t>
+      </w:r>
+      <w:hyperlink r:id="rId17" w:history="1">
+        <w:r>
+          <w:rPr>
+            <w:rStyle w:val="Hyperlink"/>
+          </w:rPr>
+          <w:t>https://luyencode.net/problem/packing</w:t>
+        </w:r>
+      </w:hyperlink>
+      <w:r>
+        <w:t xml:space="preserve">  # </w:t>
+      </w:r>
+      <w:r>
+        <w:t>FULL</w:t>
+      </w:r>
+    </w:p>
+    <w:p>
+      <w:r>
+        <w:t xml:space="preserve">X </w:t>
+      </w:r>
+      <w:hyperlink r:id="rId18" w:history="1">
+        <w:r>
+          <w:rPr>
+            <w:rStyle w:val="Hyperlink"/>
+          </w:rPr>
+          <w:t>https://luyencode.net/problem/dpprize</w:t>
+        </w:r>
+      </w:hyperlink>
+      <w:r>
+        <w:t xml:space="preserve"> # FULL</w:t>
+      </w:r>
+    </w:p>
+    <w:p>
+      <w:r>
+        <w:t>F</w:t>
+      </w:r>
+      <w:r>
+        <w:t xml:space="preserve"> </w:t>
+      </w:r>
+      <w:hyperlink r:id="rId19" w:history="1">
+        <w:r>
+          <w:rPr>
+            <w:rStyle w:val="Hyperlink"/>
+          </w:rPr>
+          <w:t>https://luyencode.net/problem/dpants</w:t>
+        </w:r>
+      </w:hyperlink>
+    </w:p>
+    <w:p>
+      <w:r>
+        <w:t xml:space="preserve">X </w:t>
+      </w:r>
+      <w:hyperlink r:id="rId20" w:history="1">
+        <w:r>
+          <w:rPr>
+            <w:rStyle w:val="Hyperlink"/>
+          </w:rPr>
+          <w:t>https://luyencode.net/problem/dpkmai</w:t>
+        </w:r>
+      </w:hyperlink>
+      <w:r>
+        <w:t xml:space="preserve"> #FULL</w:t>
+      </w:r>
+    </w:p>
+    <w:p>
+      <w:r>
         <w:t>X</w:t>
       </w:r>
       <w:r>
         <w:t xml:space="preserve"> </w:t>
       </w:r>
-      <w:hyperlink r:id="rId15" w:history="1">
-        <w:r>
-          <w:rPr>
-            <w:rStyle w:val="Hyperlink"/>
-          </w:rPr>
-          <w:t>https://luyencode.net/problem/dpmarket</w:t>
-        </w:r>
-      </w:hyperlink>
-    </w:p>
-    <w:p>
-      <w:hyperlink r:id="rId16" w:history="1">
-        <w:r>
-          <w:rPr>
-            <w:rStyle w:val="Hyperlink"/>
-          </w:rPr>
-          <w:t>https://luyencode.net/problem/dpwater</w:t>
-        </w:r>
-      </w:hyperlink>
-    </w:p>
-    <w:p>
-      <w:hyperlink r:id="rId17" w:history="1">
-        <w:r>
-          <w:rPr>
-            <w:rStyle w:val="Hyperlink"/>
-          </w:rPr>
-          <w:t>https://luyencode.net/problem/packing</w:t>
-        </w:r>
-      </w:hyperlink>
-    </w:p>
-    <w:p>
-      <w:hyperlink r:id="rId18" w:history="1">
-        <w:r>
-          <w:rPr>
-            <w:rStyle w:val="Hyperlink"/>
-          </w:rPr>
-          <w:t>https://luyencode.net/problem/dpprize</w:t>
-        </w:r>
-      </w:hyperlink>
-    </w:p>
-    <w:p>
-      <w:hyperlink r:id="rId19" w:history="1">
-        <w:r>
-          <w:rPr>
-            <w:rStyle w:val="Hyperlink"/>
-          </w:rPr>
-          <w:t>https://luyencode.net/problem/dpants</w:t>
-        </w:r>
-      </w:hyperlink>
-    </w:p>
-    <w:p>
-      <w:hyperlink r:id="rId20" w:history="1">
-        <w:r>
-          <w:rPr>
-            <w:rStyle w:val="Hyperlink"/>
-          </w:rPr>
-          <w:t>https://luyencode.net/problem/dpkmai</w:t>
+      <w:hyperlink r:id="rId21" w:history="1">
+        <w:r>
+          <w:rPr>
+            <w:rStyle w:val="Hyperlink"/>
+          </w:rPr>
+          <w:t>https://luyencode.net/problem/dpsteps</w:t>
+        </w:r>
+      </w:hyperlink>
+      <w:r>
+        <w:t xml:space="preserve"> #FULL</w:t>
+      </w:r>
+    </w:p>
+    <w:p>
+      <w:r>
+        <w:t xml:space="preserve">F </w:t>
+      </w:r>
+      <w:hyperlink r:id="rId22" w:history="1">
+        <w:r>
+          <w:rPr>
+            <w:rStyle w:val="Hyperlink"/>
+          </w:rPr>
+          <w:t>https://luyencode.net/problem/seq</w:t>
         </w:r>
       </w:hyperlink>
     </w:p>
@@ -255,32 +329,6 @@
       <w:r>
         <w:t xml:space="preserve"> </w:t>
       </w:r>
-      <w:hyperlink r:id="rId21" w:history="1">
-        <w:r>
-          <w:rPr>
-            <w:rStyle w:val="Hyperlink"/>
-          </w:rPr>
-          <w:t>https://luyencode.net/problem/dpsteps</w:t>
-        </w:r>
-      </w:hyperlink>
-    </w:p>
-    <w:p>
-      <w:hyperlink r:id="rId22" w:history="1">
-        <w:r>
-          <w:rPr>
-            <w:rStyle w:val="Hyperlink"/>
-          </w:rPr>
-          <w:t>https://luyencode.net/problem/seq</w:t>
-        </w:r>
-      </w:hyperlink>
-    </w:p>
-    <w:p>
-      <w:r>
-        <w:t>X</w:t>
-      </w:r>
-      <w:r>
-        <w:t xml:space="preserve"> </w:t>
-      </w:r>
       <w:hyperlink r:id="rId23" w:history="1">
         <w:r>
           <w:rPr>
@@ -289,6 +337,9 @@
           <w:t>https://luyencode.net/problem/thuhoach</w:t>
         </w:r>
       </w:hyperlink>
+      <w:r>
+        <w:t xml:space="preserve">   #FULL</w:t>
+      </w:r>
     </w:p>
     <w:p>
       <w:r>
@@ -307,8 +358,14 @@
           <w:t>https://luyencode.net/problem/library</w:t>
         </w:r>
       </w:hyperlink>
-    </w:p>
-    <w:p>
+      <w:r>
+        <w:t xml:space="preserve"> #FULL</w:t>
+      </w:r>
+    </w:p>
+    <w:p>
+      <w:r>
+        <w:t xml:space="preserve">F </w:t>
+      </w:r>
       <w:hyperlink r:id="rId25" w:history="1">
         <w:r>
           <w:rPr>
@@ -836,6 +893,7 @@
   <w:style w:type="character" w:default="1" w:styleId="DefaultParagraphFont">
     <w:name w:val="Default Paragraph Font"/>
     <w:uiPriority w:val="1"/>
+    <w:semiHidden/>
     <w:unhideWhenUsed/>
   </w:style>
   <w:style w:type="table" w:default="1" w:styleId="TableNormal">
@@ -934,6 +992,18 @@
     <w:rPr>
       <w:color w:val="605E5C"/>
       <w:shd w:val="clear" w:color="auto" w:fill="E1DFDD"/>
+    </w:rPr>
+  </w:style>
+  <w:style w:type="character" w:styleId="FollowedHyperlink">
+    <w:name w:val="FollowedHyperlink"/>
+    <w:basedOn w:val="DefaultParagraphFont"/>
+    <w:uiPriority w:val="99"/>
+    <w:semiHidden/>
+    <w:unhideWhenUsed/>
+    <w:rsid w:val="00F60CF5"/>
+    <w:rPr>
+      <w:color w:val="954F72" w:themeColor="followedHyperlink"/>
+      <w:u w:val="single"/>
     </w:rPr>
   </w:style>
 </w:styles>

</xml_diff>